<commit_message>
docs(architecture): suppression des références spécifiques à un opérateur national identifié
Documents rendus génériques. Cf. CHANGELOG.

Co-Authored-By: Claude Opus 4.7 (1M context) <noreply@anthropic.com>
</commit_message>
<xml_diff>
--- a/docs/architecture/docx/architecture_fonctionnelle_si_meteo.docx
+++ b/docs/architecture/docx/architecture_fonctionnelle_si_meteo.docx
@@ -448,7 +448,7 @@
         <w:t xml:space="preserve"> </w:t>
       </w:r>
       <w:r>
-        <w:t xml:space="preserve">Sponsor exécutif engagé, périmètre cible (Météo-France seul / consortium / produit), budget pluri-annuel, équipe dédiée, mandat de gouvernance transverse. Sans ces quatre, ce document reste un exercice intellectuel.</w:t>
+        <w:t xml:space="preserve">Sponsor exécutif engagé, périmètre cible (l’opérateur national seul / consortium / produit), budget pluri-annuel, équipe dédiée, mandat de gouvernance transverse. Sans ces quatre, ce document reste un exercice intellectuel.</w:t>
       </w:r>
     </w:p>
     <w:p>
@@ -817,7 +817,7 @@
         <w:t xml:space="preserve"> </w:t>
       </w:r>
       <w:r>
-        <w:t xml:space="preserve">Météo-France ou tout autre opérateur : c’est un cadre</w:t>
+        <w:t xml:space="preserve">l’opérateur national ou tout autre opérateur : c’est un cadre</w:t>
       </w:r>
       <w:r>
         <w:t xml:space="preserve"> </w:t>
@@ -874,7 +874,7 @@
         <w:t xml:space="preserve">hypothèses fondées sur des patterns publiquement décrits chez plusieurs opérateurs météo nationaux</w:t>
       </w:r>
       <w:r>
-        <w:t xml:space="preserve">. Elles ne constituent pas un audit de Météo-France.</w:t>
+        <w:t xml:space="preserve">. Elles ne constituent pas un audit de l’opérateur national.</w:t>
       </w:r>
       <w:r>
         <w:t xml:space="preserve"> </w:t>
@@ -2130,7 +2130,7 @@
         <w:pStyle w:val="FirstParagraph"/>
       </w:pPr>
       <w:r>
-        <w:t xml:space="preserve">Plusieurs initiatives publiques offrent un retour d’expérience exploitable. À analyser avant de poser la cible Météo-France.</w:t>
+        <w:t xml:space="preserve">Plusieurs initiatives publiques offrent un retour d’expérience exploitable. À analyser avant de poser la cible de l’opérateur national.</w:t>
       </w:r>
     </w:p>
     <w:bookmarkStart w:id="37" w:name="X80e2a7c2025d17e078b5d360a620a0dc7335a21"/>
@@ -3320,7 +3320,7 @@
         <w:t xml:space="preserve"> </w:t>
       </w:r>
       <w:r>
-        <w:t xml:space="preserve">Paul reçoit un signalement de feu de forêt en zone 31. Il le saisit dans le SI pompiers. La donnée arrive à Météo-France en CSV nocturne, H+18h plus tard, dans une chaîne d’enrichissement parallèle.</w:t>
+        <w:t xml:space="preserve">Paul reçoit un signalement de feu de forêt en zone 31. Il le saisit dans le SI pompiers. La donnée arrive à un opérateur national en CSV nocturne, H+18h plus tard, dans une chaîne d’enrichissement parallèle.</w:t>
       </w:r>
     </w:p>
     <w:p>
@@ -3338,7 +3338,7 @@
         <w:t xml:space="preserve"> </w:t>
       </w:r>
       <w:r>
-        <w:t xml:space="preserve">Paul saisit dans une DataWindow connectée à la plateforme. Validation supervisée en 5 minutes. La donnée alimente immédiatement les modèles de propagation, les alertes vigilance feu, le briefing préfecture. Latence saisie → utilisable : minutes.</w:t>
+        <w:t xml:space="preserve">Paul saisit dans une DataWindow connectée à la plateforme. Validation supervisée en 5 minutes. La donnée alimente immédiatement les modèles de propagation, les alertes vigilance feu, le briefing autorité locale. Latence saisie → utilisable : minutes.</w:t>
       </w:r>
     </w:p>
     <w:p>
@@ -3448,7 +3448,7 @@
         <w:t xml:space="preserve"> </w:t>
       </w:r>
       <w:r>
-        <w:t xml:space="preserve">AROME en retard à 14h. Vincent l’apprend par un mail d’une équipe aval qui se plaint. Il diagnostique en 2h.</w:t>
+        <w:t xml:space="preserve">le modèle régional est en retard à 14h. Vincent l’apprend par un mail d’une équipe aval qui se plaint. Il diagnostique en 2h.</w:t>
       </w:r>
     </w:p>
     <w:p>
@@ -3466,7 +3466,7 @@
         <w:t xml:space="preserve"> </w:t>
       </w:r>
       <w:r>
-        <w:t xml:space="preserve">AROME en retard détecté à 13:45 (15 min après l’horaire SLA). Notification automatique. Cascade calculée : 14 secondaires bloqués, 38 produits dégradés. Cause identifiée : NOMADS source amont. Communication aux consumers automatisée. MTTD : 15 min, MTTR : maîtrisé.</w:t>
+        <w:t xml:space="preserve">le modèle régional est en retard détecté à 13:45 (15 min après l’horaire SLA). Notification automatique. Cascade calculée : 14 secondaires bloqués, 38 produits dégradés. Cause identifiée : NOMADS source amont. Communication aux consumers automatisée. MTTD : 15 min, MTTR : maîtrisé.</w:t>
       </w:r>
     </w:p>
     <w:p>
@@ -9610,7 +9610,7 @@
           <w:b/>
           <w:bCs/>
         </w:rPr>
-        <w:t xml:space="preserve">Cible (Météo-France seul, consortium européen, produit générique) ?</w:t>
+        <w:t xml:space="preserve">Cible (l’opérateur national seul, consortium européen, produit générique) ?</w:t>
       </w:r>
     </w:p>
     <w:p>
@@ -9971,7 +9971,7 @@
         <w:t xml:space="preserve">Document v2 — révisé après auto-critique.</w:t>
       </w:r>
       <w:r>
-        <w:br/>
+        <w:t xml:space="preserve"> </w:t>
       </w:r>
       <w:r>
         <w:rPr>
@@ -9981,7 +9981,7 @@
         <w:t xml:space="preserve">Limites assumées et signalées : hypothèses à valider, pas de juriste relecteur, pas de chiffres terrain.</w:t>
       </w:r>
       <w:r>
-        <w:br/>
+        <w:t xml:space="preserve"> </w:t>
       </w:r>
       <w:r>
         <w:rPr>

</xml_diff>